<commit_message>
Intake tests addition and pending document updates
</commit_message>
<xml_diff>
--- a/docs/Microservices_Design_and_Development_Report_Intake_Report.docx
+++ b/docs/Microservices_Design_and_Development_Report_Intake_Report.docx
@@ -3960,14 +3960,7 @@
     </w:p>
     <w:p>
       <w:r>
-        <w:rPr>
-          <w:b/>
-          <w:bCs/>
-        </w:rPr>
-        <w:t>Evidence</w:t>
-      </w:r>
-      <w:r>
-        <w:t xml:space="preserve">: evidence/challenge-2-idempotency/run.txt and intake-service-log.txt. The script verifies complete response equality, including timestamp, and one row for eight simultaneous requests. </w:t>
+        <w:t>Evidence: evidence/challenge-2-idempotency/run.txt and intake-service-log.txt. The script verifies complete response equality, including timestamp, and one row for eight simultaneous requests. Additional HTTP tests change each of the five metadata fields separately and verify 409 while preserving the original record and response. Another test confirms that an invalid request does not consume its key: a corrected request with the same key succeeds and can then replay normally.</w:t>
       </w:r>
     </w:p>
     <w:p>
@@ -4885,7 +4878,7 @@
               <w:rPr>
                 <w:sz w:val="19"/>
               </w:rPr>
-              <w:t>23</w:t>
+              <w:t>29</w:t>
             </w:r>
           </w:p>
         </w:tc>
@@ -4909,7 +4902,7 @@
               <w:rPr>
                 <w:sz w:val="19"/>
               </w:rPr>
-              <w:t>36</w:t>
+              <w:t>42</w:t>
             </w:r>
           </w:p>
         </w:tc>
@@ -5304,7 +5297,7 @@
                 <w:b/>
                 <w:sz w:val="19"/>
               </w:rPr>
-              <w:t>80</w:t>
+              <w:t>86</w:t>
             </w:r>
           </w:p>
         </w:tc>
@@ -5333,7 +5326,7 @@
                 <w:b/>
                 <w:sz w:val="19"/>
               </w:rPr>
-              <w:t>178</w:t>
+              <w:t>184</w:t>
             </w:r>
           </w:p>
         </w:tc>
@@ -5364,7 +5357,7 @@
     </w:p>
     <w:p>
       <w:r>
-        <w:t>The per-suite test captures in evidence/tests/ report 178 tests in total with no failures, errors or skipped tests. The current build compiles for Java 17. evidence/tests/fresh-clone-run.txt records a successful earlier clean-clone build with 171 tests, followed by health, end to end, challenge and persistence checks. This earlier capture does not establish that the latest 178-test suite was run from a clean clone.</w:t>
+        <w:t>The Intake suite passed 42 tests: 13 unit and 29 HTTP/database tests, including six new cases in two test methods. The per-suite captures in evidence/tests/ now total 184 passing tests; other services use their existing captures. The build targets Java 17. evidence/tests/fresh-clone-run.txt records an earlier successful 171-test clean-clone run. The full 184-test suite was not rerun for this test-only change.</w:t>
       </w:r>
     </w:p>
     <w:p>
@@ -7680,134 +7673,6 @@
         </w:rPr>
         <w:tab/>
       </w:r>
-    </w:p>
-    <w:p>
-      <w:pPr>
-        <w:rPr>
-          <w:b/>
-          <w:bCs/>
-        </w:rPr>
-      </w:pPr>
-    </w:p>
-    <w:p>
-      <w:pPr>
-        <w:rPr>
-          <w:b/>
-          <w:bCs/>
-        </w:rPr>
-      </w:pPr>
-    </w:p>
-    <w:p>
-      <w:pPr>
-        <w:rPr>
-          <w:b/>
-          <w:bCs/>
-        </w:rPr>
-      </w:pPr>
-    </w:p>
-    <w:p>
-      <w:pPr>
-        <w:rPr>
-          <w:b/>
-          <w:bCs/>
-        </w:rPr>
-      </w:pPr>
-    </w:p>
-    <w:p>
-      <w:pPr>
-        <w:rPr>
-          <w:b/>
-          <w:bCs/>
-        </w:rPr>
-      </w:pPr>
-    </w:p>
-    <w:p>
-      <w:pPr>
-        <w:rPr>
-          <w:b/>
-          <w:bCs/>
-        </w:rPr>
-      </w:pPr>
-    </w:p>
-    <w:p>
-      <w:pPr>
-        <w:rPr>
-          <w:b/>
-          <w:bCs/>
-        </w:rPr>
-      </w:pPr>
-    </w:p>
-    <w:p>
-      <w:pPr>
-        <w:rPr>
-          <w:b/>
-          <w:bCs/>
-        </w:rPr>
-      </w:pPr>
-    </w:p>
-    <w:p>
-      <w:pPr>
-        <w:rPr>
-          <w:b/>
-          <w:bCs/>
-        </w:rPr>
-      </w:pPr>
-    </w:p>
-    <w:p>
-      <w:pPr>
-        <w:rPr>
-          <w:b/>
-          <w:bCs/>
-        </w:rPr>
-      </w:pPr>
-    </w:p>
-    <w:p>
-      <w:pPr>
-        <w:rPr>
-          <w:b/>
-          <w:bCs/>
-        </w:rPr>
-      </w:pPr>
-    </w:p>
-    <w:p>
-      <w:pPr>
-        <w:rPr>
-          <w:b/>
-          <w:bCs/>
-        </w:rPr>
-      </w:pPr>
-    </w:p>
-    <w:p>
-      <w:pPr>
-        <w:rPr>
-          <w:b/>
-          <w:bCs/>
-        </w:rPr>
-      </w:pPr>
-    </w:p>
-    <w:p>
-      <w:pPr>
-        <w:rPr>
-          <w:b/>
-          <w:bCs/>
-        </w:rPr>
-      </w:pPr>
-    </w:p>
-    <w:p>
-      <w:pPr>
-        <w:rPr>
-          <w:b/>
-          <w:bCs/>
-        </w:rPr>
-      </w:pPr>
-    </w:p>
-    <w:p>
-      <w:pPr>
-        <w:rPr>
-          <w:b/>
-          <w:bCs/>
-        </w:rPr>
-      </w:pPr>
     </w:p>
     <w:p>
       <w:pPr>

</xml_diff>